<commit_message>
docs: blind-spot closure measured in both engines; cloud figures wired
Campaign paragraph updated from 'documented with remediation plan' to
the closed state: axis-swept sections, hex r/R = 0.89 in twin AND Isaac
RTX, 0 permissive of 60. Cloud figures wired into report/architecture/
deck; GOST regenerated with the hex point-cloud as Figure 3.

Co-Authored-By: Claude Fable 5 <noreply@anthropic.com>
</commit_message>
<xml_diff>
--- a/docs/report/final_report_gost.docx
+++ b/docs/report/final_report_gost.docx
@@ -215,7 +215,7 @@
       <w:r>
         <w:fldChar w:fldCharType="separate"/>
       </w:r>
-      <w:hyperlink w:anchor="_Toc235125057" w:history="1">
+      <w:hyperlink w:anchor="_Toc235171811" w:history="1">
         <w:r>
           <w:rPr>
             <w:rStyle w:val="aff8"/>
@@ -242,7 +242,7 @@
             <w:noProof/>
             <w:webHidden/>
           </w:rPr>
-          <w:instrText xml:space="preserve"> PAGEREF _Toc235125057 \h </w:instrText>
+          <w:instrText xml:space="preserve"> PAGEREF _Toc235171811 \h </w:instrText>
         </w:r>
         <w:r>
           <w:rPr>
@@ -288,7 +288,7 @@
           <w14:ligatures w14:val="standardContextual"/>
         </w:rPr>
       </w:pPr>
-      <w:hyperlink w:anchor="_Toc235125058" w:history="1">
+      <w:hyperlink w:anchor="_Toc235171812" w:history="1">
         <w:r>
           <w:rPr>
             <w:rStyle w:val="aff8"/>
@@ -315,7 +315,7 @@
             <w:noProof/>
             <w:webHidden/>
           </w:rPr>
-          <w:instrText xml:space="preserve"> PAGEREF _Toc235125058 \h </w:instrText>
+          <w:instrText xml:space="preserve"> PAGEREF _Toc235171812 \h </w:instrText>
         </w:r>
         <w:r>
           <w:rPr>
@@ -361,7 +361,7 @@
           <w14:ligatures w14:val="standardContextual"/>
         </w:rPr>
       </w:pPr>
-      <w:hyperlink w:anchor="_Toc235125059" w:history="1">
+      <w:hyperlink w:anchor="_Toc235171813" w:history="1">
         <w:r>
           <w:rPr>
             <w:rStyle w:val="aff8"/>
@@ -388,7 +388,7 @@
             <w:noProof/>
             <w:webHidden/>
           </w:rPr>
-          <w:instrText xml:space="preserve"> PAGEREF _Toc235125059 \h </w:instrText>
+          <w:instrText xml:space="preserve"> PAGEREF _Toc235171813 \h </w:instrText>
         </w:r>
         <w:r>
           <w:rPr>
@@ -434,7 +434,7 @@
           <w14:ligatures w14:val="standardContextual"/>
         </w:rPr>
       </w:pPr>
-      <w:hyperlink w:anchor="_Toc235125060" w:history="1">
+      <w:hyperlink w:anchor="_Toc235171814" w:history="1">
         <w:r>
           <w:rPr>
             <w:rStyle w:val="aff8"/>
@@ -461,7 +461,7 @@
             <w:noProof/>
             <w:webHidden/>
           </w:rPr>
-          <w:instrText xml:space="preserve"> PAGEREF _Toc235125060 \h </w:instrText>
+          <w:instrText xml:space="preserve"> PAGEREF _Toc235171814 \h </w:instrText>
         </w:r>
         <w:r>
           <w:rPr>
@@ -507,7 +507,7 @@
           <w14:ligatures w14:val="standardContextual"/>
         </w:rPr>
       </w:pPr>
-      <w:hyperlink w:anchor="_Toc235125061" w:history="1">
+      <w:hyperlink w:anchor="_Toc235171815" w:history="1">
         <w:r>
           <w:rPr>
             <w:rStyle w:val="aff8"/>
@@ -534,7 +534,7 @@
             <w:noProof/>
             <w:webHidden/>
           </w:rPr>
-          <w:instrText xml:space="preserve"> PAGEREF _Toc235125061 \h </w:instrText>
+          <w:instrText xml:space="preserve"> PAGEREF _Toc235171815 \h </w:instrText>
         </w:r>
         <w:r>
           <w:rPr>
@@ -580,7 +580,7 @@
           <w14:ligatures w14:val="standardContextual"/>
         </w:rPr>
       </w:pPr>
-      <w:hyperlink w:anchor="_Toc235125062" w:history="1">
+      <w:hyperlink w:anchor="_Toc235171816" w:history="1">
         <w:r>
           <w:rPr>
             <w:rStyle w:val="aff8"/>
@@ -607,7 +607,7 @@
             <w:noProof/>
             <w:webHidden/>
           </w:rPr>
-          <w:instrText xml:space="preserve"> PAGEREF _Toc235125062 \h </w:instrText>
+          <w:instrText xml:space="preserve"> PAGEREF _Toc235171816 \h </w:instrText>
         </w:r>
         <w:r>
           <w:rPr>
@@ -653,7 +653,7 @@
           <w14:ligatures w14:val="standardContextual"/>
         </w:rPr>
       </w:pPr>
-      <w:hyperlink w:anchor="_Toc235125063" w:history="1">
+      <w:hyperlink w:anchor="_Toc235171817" w:history="1">
         <w:r>
           <w:rPr>
             <w:rStyle w:val="aff8"/>
@@ -680,7 +680,7 @@
             <w:noProof/>
             <w:webHidden/>
           </w:rPr>
-          <w:instrText xml:space="preserve"> PAGEREF _Toc235125063 \h </w:instrText>
+          <w:instrText xml:space="preserve"> PAGEREF _Toc235171817 \h </w:instrText>
         </w:r>
         <w:r>
           <w:rPr>
@@ -726,7 +726,7 @@
           <w14:ligatures w14:val="standardContextual"/>
         </w:rPr>
       </w:pPr>
-      <w:hyperlink w:anchor="_Toc235125064" w:history="1">
+      <w:hyperlink w:anchor="_Toc235171818" w:history="1">
         <w:r>
           <w:rPr>
             <w:rStyle w:val="aff8"/>
@@ -753,7 +753,7 @@
             <w:noProof/>
             <w:webHidden/>
           </w:rPr>
-          <w:instrText xml:space="preserve"> PAGEREF _Toc235125064 \h </w:instrText>
+          <w:instrText xml:space="preserve"> PAGEREF _Toc235171818 \h </w:instrText>
         </w:r>
         <w:r>
           <w:rPr>
@@ -799,7 +799,7 @@
           <w14:ligatures w14:val="standardContextual"/>
         </w:rPr>
       </w:pPr>
-      <w:hyperlink w:anchor="_Toc235125065" w:history="1">
+      <w:hyperlink w:anchor="_Toc235171819" w:history="1">
         <w:r>
           <w:rPr>
             <w:rStyle w:val="aff8"/>
@@ -826,7 +826,7 @@
             <w:noProof/>
             <w:webHidden/>
           </w:rPr>
-          <w:instrText xml:space="preserve"> PAGEREF _Toc235125065 \h </w:instrText>
+          <w:instrText xml:space="preserve"> PAGEREF _Toc235171819 \h </w:instrText>
         </w:r>
         <w:r>
           <w:rPr>
@@ -872,7 +872,7 @@
           <w14:ligatures w14:val="standardContextual"/>
         </w:rPr>
       </w:pPr>
-      <w:hyperlink w:anchor="_Toc235125066" w:history="1">
+      <w:hyperlink w:anchor="_Toc235171820" w:history="1">
         <w:r>
           <w:rPr>
             <w:rStyle w:val="aff8"/>
@@ -899,7 +899,7 @@
             <w:noProof/>
             <w:webHidden/>
           </w:rPr>
-          <w:instrText xml:space="preserve"> PAGEREF _Toc235125066 \h </w:instrText>
+          <w:instrText xml:space="preserve"> PAGEREF _Toc235171820 \h </w:instrText>
         </w:r>
         <w:r>
           <w:rPr>
@@ -945,7 +945,7 @@
           <w14:ligatures w14:val="standardContextual"/>
         </w:rPr>
       </w:pPr>
-      <w:hyperlink w:anchor="_Toc235125067" w:history="1">
+      <w:hyperlink w:anchor="_Toc235171821" w:history="1">
         <w:r>
           <w:rPr>
             <w:rStyle w:val="aff8"/>
@@ -972,7 +972,7 @@
             <w:noProof/>
             <w:webHidden/>
           </w:rPr>
-          <w:instrText xml:space="preserve"> PAGEREF _Toc235125067 \h </w:instrText>
+          <w:instrText xml:space="preserve"> PAGEREF _Toc235171821 \h </w:instrText>
         </w:r>
         <w:r>
           <w:rPr>
@@ -1018,7 +1018,7 @@
           <w14:ligatures w14:val="standardContextual"/>
         </w:rPr>
       </w:pPr>
-      <w:hyperlink w:anchor="_Toc235125068" w:history="1">
+      <w:hyperlink w:anchor="_Toc235171822" w:history="1">
         <w:r>
           <w:rPr>
             <w:rStyle w:val="aff8"/>
@@ -1045,7 +1045,7 @@
             <w:noProof/>
             <w:webHidden/>
           </w:rPr>
-          <w:instrText xml:space="preserve"> PAGEREF _Toc235125068 \h </w:instrText>
+          <w:instrText xml:space="preserve"> PAGEREF _Toc235171822 \h </w:instrText>
         </w:r>
         <w:r>
           <w:rPr>
@@ -1065,7 +1065,7 @@
             <w:noProof/>
             <w:webHidden/>
           </w:rPr>
-          <w:t>9</w:t>
+          <w:t>10</w:t>
         </w:r>
         <w:r>
           <w:rPr>
@@ -1091,7 +1091,7 @@
           <w14:ligatures w14:val="standardContextual"/>
         </w:rPr>
       </w:pPr>
-      <w:hyperlink w:anchor="_Toc235125069" w:history="1">
+      <w:hyperlink w:anchor="_Toc235171823" w:history="1">
         <w:r>
           <w:rPr>
             <w:rStyle w:val="aff8"/>
@@ -1118,7 +1118,7 @@
             <w:noProof/>
             <w:webHidden/>
           </w:rPr>
-          <w:instrText xml:space="preserve"> PAGEREF _Toc235125069 \h </w:instrText>
+          <w:instrText xml:space="preserve"> PAGEREF _Toc235171823 \h </w:instrText>
         </w:r>
         <w:r>
           <w:rPr>
@@ -1138,7 +1138,7 @@
             <w:noProof/>
             <w:webHidden/>
           </w:rPr>
-          <w:t>9</w:t>
+          <w:t>10</w:t>
         </w:r>
         <w:r>
           <w:rPr>
@@ -1164,7 +1164,7 @@
           <w14:ligatures w14:val="standardContextual"/>
         </w:rPr>
       </w:pPr>
-      <w:hyperlink w:anchor="_Toc235125070" w:history="1">
+      <w:hyperlink w:anchor="_Toc235171824" w:history="1">
         <w:r>
           <w:rPr>
             <w:rStyle w:val="aff8"/>
@@ -1191,7 +1191,7 @@
             <w:noProof/>
             <w:webHidden/>
           </w:rPr>
-          <w:instrText xml:space="preserve"> PAGEREF _Toc235125070 \h </w:instrText>
+          <w:instrText xml:space="preserve"> PAGEREF _Toc235171824 \h </w:instrText>
         </w:r>
         <w:r>
           <w:rPr>
@@ -1211,7 +1211,7 @@
             <w:noProof/>
             <w:webHidden/>
           </w:rPr>
-          <w:t>10</w:t>
+          <w:t>11</w:t>
         </w:r>
         <w:r>
           <w:rPr>
@@ -1237,7 +1237,7 @@
           <w14:ligatures w14:val="standardContextual"/>
         </w:rPr>
       </w:pPr>
-      <w:hyperlink w:anchor="_Toc235125071" w:history="1">
+      <w:hyperlink w:anchor="_Toc235171825" w:history="1">
         <w:r>
           <w:rPr>
             <w:rStyle w:val="aff8"/>
@@ -1264,7 +1264,7 @@
             <w:noProof/>
             <w:webHidden/>
           </w:rPr>
-          <w:instrText xml:space="preserve"> PAGEREF _Toc235125071 \h </w:instrText>
+          <w:instrText xml:space="preserve"> PAGEREF _Toc235171825 \h </w:instrText>
         </w:r>
         <w:r>
           <w:rPr>
@@ -1284,7 +1284,7 @@
             <w:noProof/>
             <w:webHidden/>
           </w:rPr>
-          <w:t>11</w:t>
+          <w:t>12</w:t>
         </w:r>
         <w:r>
           <w:rPr>
@@ -1310,7 +1310,7 @@
           <w14:ligatures w14:val="standardContextual"/>
         </w:rPr>
       </w:pPr>
-      <w:hyperlink w:anchor="_Toc235125072" w:history="1">
+      <w:hyperlink w:anchor="_Toc235171826" w:history="1">
         <w:r>
           <w:rPr>
             <w:rStyle w:val="aff8"/>
@@ -1337,7 +1337,7 @@
             <w:noProof/>
             <w:webHidden/>
           </w:rPr>
-          <w:instrText xml:space="preserve"> PAGEREF _Toc235125072 \h </w:instrText>
+          <w:instrText xml:space="preserve"> PAGEREF _Toc235171826 \h </w:instrText>
         </w:r>
         <w:r>
           <w:rPr>
@@ -1357,7 +1357,7 @@
             <w:noProof/>
             <w:webHidden/>
           </w:rPr>
-          <w:t>11</w:t>
+          <w:t>12</w:t>
         </w:r>
         <w:r>
           <w:rPr>
@@ -1383,7 +1383,7 @@
           <w14:ligatures w14:val="standardContextual"/>
         </w:rPr>
       </w:pPr>
-      <w:hyperlink w:anchor="_Toc235125073" w:history="1">
+      <w:hyperlink w:anchor="_Toc235171827" w:history="1">
         <w:r>
           <w:rPr>
             <w:rStyle w:val="aff8"/>
@@ -1410,7 +1410,7 @@
             <w:noProof/>
             <w:webHidden/>
           </w:rPr>
-          <w:instrText xml:space="preserve"> PAGEREF _Toc235125073 \h </w:instrText>
+          <w:instrText xml:space="preserve"> PAGEREF _Toc235171827 \h </w:instrText>
         </w:r>
         <w:r>
           <w:rPr>
@@ -1430,7 +1430,7 @@
             <w:noProof/>
             <w:webHidden/>
           </w:rPr>
-          <w:t>12</w:t>
+          <w:t>13</w:t>
         </w:r>
         <w:r>
           <w:rPr>
@@ -1456,7 +1456,7 @@
           <w14:ligatures w14:val="standardContextual"/>
         </w:rPr>
       </w:pPr>
-      <w:hyperlink w:anchor="_Toc235125074" w:history="1">
+      <w:hyperlink w:anchor="_Toc235171828" w:history="1">
         <w:r>
           <w:rPr>
             <w:rStyle w:val="aff8"/>
@@ -1483,7 +1483,7 @@
             <w:noProof/>
             <w:webHidden/>
           </w:rPr>
-          <w:instrText xml:space="preserve"> PAGEREF _Toc235125074 \h </w:instrText>
+          <w:instrText xml:space="preserve"> PAGEREF _Toc235171828 \h </w:instrText>
         </w:r>
         <w:r>
           <w:rPr>
@@ -1503,7 +1503,7 @@
             <w:noProof/>
             <w:webHidden/>
           </w:rPr>
-          <w:t>12</w:t>
+          <w:t>13</w:t>
         </w:r>
         <w:r>
           <w:rPr>
@@ -1529,7 +1529,7 @@
           <w14:ligatures w14:val="standardContextual"/>
         </w:rPr>
       </w:pPr>
-      <w:hyperlink w:anchor="_Toc235125075" w:history="1">
+      <w:hyperlink w:anchor="_Toc235171829" w:history="1">
         <w:r>
           <w:rPr>
             <w:rStyle w:val="aff8"/>
@@ -1556,7 +1556,7 @@
             <w:noProof/>
             <w:webHidden/>
           </w:rPr>
-          <w:instrText xml:space="preserve"> PAGEREF _Toc235125075 \h </w:instrText>
+          <w:instrText xml:space="preserve"> PAGEREF _Toc235171829 \h </w:instrText>
         </w:r>
         <w:r>
           <w:rPr>
@@ -1576,7 +1576,7 @@
             <w:noProof/>
             <w:webHidden/>
           </w:rPr>
-          <w:t>13</w:t>
+          <w:t>14</w:t>
         </w:r>
         <w:r>
           <w:rPr>
@@ -1602,7 +1602,7 @@
           <w14:ligatures w14:val="standardContextual"/>
         </w:rPr>
       </w:pPr>
-      <w:hyperlink w:anchor="_Toc235125076" w:history="1">
+      <w:hyperlink w:anchor="_Toc235171830" w:history="1">
         <w:r>
           <w:rPr>
             <w:rStyle w:val="aff8"/>
@@ -1629,7 +1629,7 @@
             <w:noProof/>
             <w:webHidden/>
           </w:rPr>
-          <w:instrText xml:space="preserve"> PAGEREF _Toc235125076 \h </w:instrText>
+          <w:instrText xml:space="preserve"> PAGEREF _Toc235171830 \h </w:instrText>
         </w:r>
         <w:r>
           <w:rPr>
@@ -1649,7 +1649,7 @@
             <w:noProof/>
             <w:webHidden/>
           </w:rPr>
-          <w:t>13</w:t>
+          <w:t>14</w:t>
         </w:r>
         <w:r>
           <w:rPr>
@@ -1675,7 +1675,7 @@
           <w14:ligatures w14:val="standardContextual"/>
         </w:rPr>
       </w:pPr>
-      <w:hyperlink w:anchor="_Toc235125077" w:history="1">
+      <w:hyperlink w:anchor="_Toc235171831" w:history="1">
         <w:r>
           <w:rPr>
             <w:rStyle w:val="aff8"/>
@@ -1702,7 +1702,7 @@
             <w:noProof/>
             <w:webHidden/>
           </w:rPr>
-          <w:instrText xml:space="preserve"> PAGEREF _Toc235125077 \h </w:instrText>
+          <w:instrText xml:space="preserve"> PAGEREF _Toc235171831 \h </w:instrText>
         </w:r>
         <w:r>
           <w:rPr>
@@ -1722,7 +1722,7 @@
             <w:noProof/>
             <w:webHidden/>
           </w:rPr>
-          <w:t>13</w:t>
+          <w:t>14</w:t>
         </w:r>
         <w:r>
           <w:rPr>
@@ -1748,7 +1748,7 @@
           <w14:ligatures w14:val="standardContextual"/>
         </w:rPr>
       </w:pPr>
-      <w:hyperlink w:anchor="_Toc235125078" w:history="1">
+      <w:hyperlink w:anchor="_Toc235171832" w:history="1">
         <w:r>
           <w:rPr>
             <w:rStyle w:val="aff8"/>
@@ -1775,7 +1775,7 @@
             <w:noProof/>
             <w:webHidden/>
           </w:rPr>
-          <w:instrText xml:space="preserve"> PAGEREF _Toc235125078 \h </w:instrText>
+          <w:instrText xml:space="preserve"> PAGEREF _Toc235171832 \h </w:instrText>
         </w:r>
         <w:r>
           <w:rPr>
@@ -1795,7 +1795,7 @@
             <w:noProof/>
             <w:webHidden/>
           </w:rPr>
-          <w:t>14</w:t>
+          <w:t>15</w:t>
         </w:r>
         <w:r>
           <w:rPr>
@@ -1821,7 +1821,7 @@
           <w14:ligatures w14:val="standardContextual"/>
         </w:rPr>
       </w:pPr>
-      <w:hyperlink w:anchor="_Toc235125079" w:history="1">
+      <w:hyperlink w:anchor="_Toc235171833" w:history="1">
         <w:r>
           <w:rPr>
             <w:rStyle w:val="aff8"/>
@@ -1848,7 +1848,7 @@
             <w:noProof/>
             <w:webHidden/>
           </w:rPr>
-          <w:instrText xml:space="preserve"> PAGEREF _Toc235125079 \h </w:instrText>
+          <w:instrText xml:space="preserve"> PAGEREF _Toc235171833 \h </w:instrText>
         </w:r>
         <w:r>
           <w:rPr>
@@ -1868,7 +1868,7 @@
             <w:noProof/>
             <w:webHidden/>
           </w:rPr>
-          <w:t>14</w:t>
+          <w:t>15</w:t>
         </w:r>
         <w:r>
           <w:rPr>
@@ -1894,7 +1894,7 @@
           <w14:ligatures w14:val="standardContextual"/>
         </w:rPr>
       </w:pPr>
-      <w:hyperlink w:anchor="_Toc235125080" w:history="1">
+      <w:hyperlink w:anchor="_Toc235171834" w:history="1">
         <w:r>
           <w:rPr>
             <w:rStyle w:val="aff8"/>
@@ -1921,7 +1921,7 @@
             <w:noProof/>
             <w:webHidden/>
           </w:rPr>
-          <w:instrText xml:space="preserve"> PAGEREF _Toc235125080 \h </w:instrText>
+          <w:instrText xml:space="preserve"> PAGEREF _Toc235171834 \h </w:instrText>
         </w:r>
         <w:r>
           <w:rPr>
@@ -1941,7 +1941,7 @@
             <w:noProof/>
             <w:webHidden/>
           </w:rPr>
-          <w:t>14</w:t>
+          <w:t>15</w:t>
         </w:r>
         <w:r>
           <w:rPr>
@@ -1967,7 +1967,7 @@
           <w14:ligatures w14:val="standardContextual"/>
         </w:rPr>
       </w:pPr>
-      <w:hyperlink w:anchor="_Toc235125081" w:history="1">
+      <w:hyperlink w:anchor="_Toc235171835" w:history="1">
         <w:r>
           <w:rPr>
             <w:rStyle w:val="aff8"/>
@@ -1994,7 +1994,7 @@
             <w:noProof/>
             <w:webHidden/>
           </w:rPr>
-          <w:instrText xml:space="preserve"> PAGEREF _Toc235125081 \h </w:instrText>
+          <w:instrText xml:space="preserve"> PAGEREF _Toc235171835 \h </w:instrText>
         </w:r>
         <w:r>
           <w:rPr>
@@ -2014,7 +2014,7 @@
             <w:noProof/>
             <w:webHidden/>
           </w:rPr>
-          <w:t>15</w:t>
+          <w:t>16</w:t>
         </w:r>
         <w:r>
           <w:rPr>
@@ -2040,7 +2040,7 @@
           <w14:ligatures w14:val="standardContextual"/>
         </w:rPr>
       </w:pPr>
-      <w:hyperlink w:anchor="_Toc235125082" w:history="1">
+      <w:hyperlink w:anchor="_Toc235171836" w:history="1">
         <w:r>
           <w:rPr>
             <w:rStyle w:val="aff8"/>
@@ -2067,7 +2067,7 @@
             <w:noProof/>
             <w:webHidden/>
           </w:rPr>
-          <w:instrText xml:space="preserve"> PAGEREF _Toc235125082 \h </w:instrText>
+          <w:instrText xml:space="preserve"> PAGEREF _Toc235171836 \h </w:instrText>
         </w:r>
         <w:r>
           <w:rPr>
@@ -2087,7 +2087,7 @@
             <w:noProof/>
             <w:webHidden/>
           </w:rPr>
-          <w:t>15</w:t>
+          <w:t>16</w:t>
         </w:r>
         <w:r>
           <w:rPr>
@@ -2113,7 +2113,7 @@
           <w14:ligatures w14:val="standardContextual"/>
         </w:rPr>
       </w:pPr>
-      <w:hyperlink w:anchor="_Toc235125083" w:history="1">
+      <w:hyperlink w:anchor="_Toc235171837" w:history="1">
         <w:r>
           <w:rPr>
             <w:rStyle w:val="aff8"/>
@@ -2140,7 +2140,7 @@
             <w:noProof/>
             <w:webHidden/>
           </w:rPr>
-          <w:instrText xml:space="preserve"> PAGEREF _Toc235125083 \h </w:instrText>
+          <w:instrText xml:space="preserve"> PAGEREF _Toc235171837 \h </w:instrText>
         </w:r>
         <w:r>
           <w:rPr>
@@ -2160,7 +2160,7 @@
             <w:noProof/>
             <w:webHidden/>
           </w:rPr>
-          <w:t>17</w:t>
+          <w:t>18</w:t>
         </w:r>
         <w:r>
           <w:rPr>
@@ -2186,7 +2186,7 @@
           <w14:ligatures w14:val="standardContextual"/>
         </w:rPr>
       </w:pPr>
-      <w:hyperlink w:anchor="_Toc235125084" w:history="1">
+      <w:hyperlink w:anchor="_Toc235171838" w:history="1">
         <w:r>
           <w:rPr>
             <w:rStyle w:val="aff8"/>
@@ -2213,7 +2213,7 @@
             <w:noProof/>
             <w:webHidden/>
           </w:rPr>
-          <w:instrText xml:space="preserve"> PAGEREF _Toc235125084 \h </w:instrText>
+          <w:instrText xml:space="preserve"> PAGEREF _Toc235171838 \h </w:instrText>
         </w:r>
         <w:r>
           <w:rPr>
@@ -2233,7 +2233,7 @@
             <w:noProof/>
             <w:webHidden/>
           </w:rPr>
-          <w:t>18</w:t>
+          <w:t>19</w:t>
         </w:r>
         <w:r>
           <w:rPr>
@@ -2261,7 +2261,7 @@
       <w:pPr>
         <w:pStyle w:val="1"/>
       </w:pPr>
-      <w:bookmarkStart w:id="0" w:name="_Toc235125057"/>
+      <w:bookmarkStart w:id="0" w:name="_Toc235171811"/>
       <w:r>
         <w:t>Определения, обозначения и сокращения</w:t>
       </w:r>
@@ -2850,7 +2850,7 @@
       <w:pPr>
         <w:pStyle w:val="1"/>
       </w:pPr>
-      <w:bookmarkStart w:id="1" w:name="_Toc235125058"/>
+      <w:bookmarkStart w:id="1" w:name="_Toc235171812"/>
       <w:r>
         <w:t>Введение</w:t>
       </w:r>
@@ -2875,7 +2875,7 @@
       <w:pPr>
         <w:pStyle w:val="1"/>
       </w:pPr>
-      <w:bookmarkStart w:id="2" w:name="_Toc235125059"/>
+      <w:bookmarkStart w:id="2" w:name="_Toc235171813"/>
       <w:r>
         <w:t>1 Постановка задачи и границы решения</w:t>
       </w:r>
@@ -2885,7 +2885,7 @@
       <w:pPr>
         <w:pStyle w:val="21"/>
       </w:pPr>
-      <w:bookmarkStart w:id="3" w:name="_Toc235125060"/>
+      <w:bookmarkStart w:id="3" w:name="_Toc235171814"/>
       <w:r>
         <w:t>1.1 Рабочий участок и зоны</w:t>
       </w:r>
@@ -2909,7 +2909,7 @@
           <w:noProof/>
         </w:rPr>
         <w:drawing>
-          <wp:inline distT="0" distB="0" distL="0" distR="0" wp14:anchorId="05539468" wp14:editId="72711CD7">
+          <wp:inline distT="0" distB="0" distL="0" distR="0" wp14:anchorId="63946B5A" wp14:editId="4FE7493D">
             <wp:extent cx="5760000" cy="3456000"/>
             <wp:effectExtent l="0" t="0" r="0" b="0"/>
             <wp:docPr id="1" name="Picture 1"/>
@@ -2962,7 +2962,7 @@
       <w:pPr>
         <w:pStyle w:val="21"/>
       </w:pPr>
-      <w:bookmarkStart w:id="4" w:name="_Toc235125061"/>
+      <w:bookmarkStart w:id="4" w:name="_Toc235171815"/>
       <w:r>
         <w:t>1.2 Соответствие терминов задания узлам ячейки</w:t>
       </w:r>
@@ -3273,7 +3273,7 @@
       <w:pPr>
         <w:pStyle w:val="1"/>
       </w:pPr>
-      <w:bookmarkStart w:id="5" w:name="_Toc235125062"/>
+      <w:bookmarkStart w:id="5" w:name="_Toc235171816"/>
       <w:r>
         <w:t>2 Система определения и классификации товара</w:t>
       </w:r>
@@ -3283,7 +3283,7 @@
       <w:pPr>
         <w:pStyle w:val="21"/>
       </w:pPr>
-      <w:bookmarkStart w:id="6" w:name="_Toc235125063"/>
+      <w:bookmarkStart w:id="6" w:name="_Toc235171817"/>
       <w:r>
         <w:t>2.1 Принцип и состав измерительной станции</w:t>
       </w:r>
@@ -3321,7 +3321,7 @@
       <w:pPr>
         <w:pStyle w:val="21"/>
       </w:pPr>
-      <w:bookmarkStart w:id="7" w:name="_Toc235125064"/>
+      <w:bookmarkStart w:id="7" w:name="_Toc235171818"/>
       <w:r>
         <w:t>2.2 Порядок применения правил</w:t>
       </w:r>
@@ -3351,7 +3351,7 @@
       <w:pPr>
         <w:pStyle w:val="21"/>
       </w:pPr>
-      <w:bookmarkStart w:id="8" w:name="_Toc235125065"/>
+      <w:bookmarkStart w:id="8" w:name="_Toc235171819"/>
       <w:r>
         <w:t>2.3 Метрологические охранные полосы</w:t>
       </w:r>
@@ -3372,7 +3372,7 @@
           <w:noProof/>
         </w:rPr>
         <w:drawing>
-          <wp:inline distT="0" distB="0" distL="0" distR="0" wp14:anchorId="786C53BF" wp14:editId="6ED5B919">
+          <wp:inline distT="0" distB="0" distL="0" distR="0" wp14:anchorId="76F1986D" wp14:editId="2D7183B0">
             <wp:extent cx="5760000" cy="3240000"/>
             <wp:effectExtent l="0" t="0" r="0" b="0"/>
             <wp:docPr id="2" name="Picture 2"/>
@@ -3425,7 +3425,7 @@
       <w:pPr>
         <w:pStyle w:val="21"/>
       </w:pPr>
-      <w:bookmarkStart w:id="9" w:name="_Toc235125066"/>
+      <w:bookmarkStart w:id="9" w:name="_Toc235171820"/>
       <w:r>
         <w:t>2.4 Политики безопасной стороны</w:t>
       </w:r>
@@ -3460,7 +3460,7 @@
       <w:pPr>
         <w:pStyle w:val="21"/>
       </w:pPr>
-      <w:bookmarkStart w:id="10" w:name="_Toc235125067"/>
+      <w:bookmarkStart w:id="10" w:name="_Toc235171821"/>
       <w:r>
         <w:t>2.5 Результаты проверки классификатора</w:t>
       </w:r>
@@ -3472,10 +3472,77 @@
       </w:r>
     </w:p>
     <w:p>
+      <w:r>
+        <w:t>Обобщающая способность за пределами официального набора проверена адверсарной кампанией из 30 процедурно сгенерированных тел в двух позах каждое (60 классификаций). Кампания выявила два пермиссивных случая; оба устранены и перемерены. Лежащая шестигранная призма обходила проверку сечения по главной оси (почти квадратный след дает вырожденную ось PCA) — устранено разверткой сечений по двенадцати осям резки, что напрямую соответствует официальной формулировке критерия («круг в сечении по любой оси»); после ус</w:t>
+      </w:r>
+      <w:r>
+        <w:t>транения призма читается r/R = 0,89 в обоих движках (двойник и RTX-станция Isaac Sim). Второй случай оказался дефектом испытательного стенда. Итог кампании: ноль пермиссивных решений из 60, остальные расхождения — консервативные, в сторону C/D/REVIEW.</w:t>
+      </w:r>
+    </w:p>
+    <w:p>
+      <w:pPr>
+        <w:ind w:firstLine="0"/>
+        <w:jc w:val="center"/>
+      </w:pPr>
+      <w:r>
+        <w:rPr>
+          <w:noProof/>
+        </w:rPr>
+        <w:drawing>
+          <wp:inline distT="0" distB="0" distL="0" distR="0" wp14:anchorId="76D5B49A" wp14:editId="7F7E6496">
+            <wp:extent cx="5760000" cy="3240000"/>
+            <wp:effectExtent l="0" t="0" r="0" b="0"/>
+            <wp:docPr id="3" name="Picture 3"/>
+            <wp:cNvGraphicFramePr>
+              <a:graphicFrameLocks xmlns:a="http://schemas.openxmlformats.org/drawingml/2006/main" noChangeAspect="1"/>
+            </wp:cNvGraphicFramePr>
+            <a:graphic xmlns:a="http://schemas.openxmlformats.org/drawingml/2006/main">
+              <a:graphicData uri="http://schemas.openxmlformats.org/drawingml/2006/picture">
+                <pic:pic xmlns:pic="http://schemas.openxmlformats.org/drawingml/2006/picture">
+                  <pic:nvPicPr>
+                    <pic:cNvPr id="0" name="cloud_hex_lying.png"/>
+                    <pic:cNvPicPr/>
+                  </pic:nvPicPr>
+                  <pic:blipFill>
+                    <a:blip r:embed="rId10"/>
+                    <a:stretch>
+                      <a:fillRect/>
+                    </a:stretch>
+                  </pic:blipFill>
+                  <pic:spPr>
+                    <a:xfrm>
+                      <a:off x="0" y="0"/>
+                      <a:ext cx="5760000" cy="3240000"/>
+                    </a:xfrm>
+                    <a:prstGeom prst="rect">
+                      <a:avLst/>
+                    </a:prstGeom>
+                  </pic:spPr>
+                </pic:pic>
+              </a:graphicData>
+            </a:graphic>
+          </wp:inline>
+        </w:drawing>
+      </w:r>
+    </w:p>
+    <w:p>
+      <w:pPr>
+        <w:spacing w:after="240"/>
+        <w:ind w:firstLine="0"/>
+        <w:jc w:val="center"/>
+      </w:pPr>
+      <w:r>
+        <w:rPr>
+          <w:sz w:val="24"/>
+        </w:rPr>
+        <w:t>Рисунок 3 — Облако точек сенсора: лежащая шестигранная призма — решающее сечение с вписанной и описанной окружностями (r/R = 0,85), направление в зону D</w:t>
+      </w:r>
+    </w:p>
+    <w:p>
       <w:pPr>
         <w:pStyle w:val="1"/>
       </w:pPr>
-      <w:bookmarkStart w:id="11" w:name="_Toc235125068"/>
+      <w:bookmarkStart w:id="11" w:name="_Toc235171822"/>
       <w:r>
         <w:t>3 Исполнительная часть</w:t>
       </w:r>
@@ -3485,7 +3552,7 @@
       <w:pPr>
         <w:pStyle w:val="21"/>
       </w:pPr>
-      <w:bookmarkStart w:id="12" w:name="_Toc235125069"/>
+      <w:bookmarkStart w:id="12" w:name="_Toc235171823"/>
       <w:r>
         <w:t>3.1 Обоснование выбора механизма</w:t>
       </w:r>
@@ -3506,10 +3573,10 @@
           <w:noProof/>
         </w:rPr>
         <w:drawing>
-          <wp:inline distT="0" distB="0" distL="0" distR="0" wp14:anchorId="182AF7E2" wp14:editId="4374600F">
+          <wp:inline distT="0" distB="0" distL="0" distR="0" wp14:anchorId="2EE5DD62" wp14:editId="436ABB10">
             <wp:extent cx="5760000" cy="4189091"/>
             <wp:effectExtent l="0" t="0" r="0" b="0"/>
-            <wp:docPr id="3" name="Picture 3"/>
+            <wp:docPr id="4" name="Picture 4"/>
             <wp:cNvGraphicFramePr>
               <a:graphicFrameLocks xmlns:a="http://schemas.openxmlformats.org/drawingml/2006/main" noChangeAspect="1"/>
             </wp:cNvGraphicFramePr>
@@ -3521,7 +3588,7 @@
                     <pic:cNvPicPr/>
                   </pic:nvPicPr>
                   <pic:blipFill>
-                    <a:blip r:embed="rId10"/>
+                    <a:blip r:embed="rId11"/>
                     <a:stretch>
                       <a:fillRect/>
                     </a:stretch>
@@ -3552,14 +3619,14 @@
         <w:rPr>
           <w:sz w:val="24"/>
         </w:rPr>
-        <w:t>Рисунок 3 — Кинематическая схема каретки с приводом наклона лотка</w:t>
+        <w:t>Рисунок 4 — Кинематическая схема каретки с приводом наклона лотка</w:t>
       </w:r>
     </w:p>
     <w:p>
       <w:pPr>
         <w:pStyle w:val="21"/>
       </w:pPr>
-      <w:bookmarkStart w:id="13" w:name="_Toc235125070"/>
+      <w:bookmarkStart w:id="13" w:name="_Toc235171824"/>
       <w:r>
         <w:t>3.2 Рабочий цикл</w:t>
       </w:r>
@@ -3577,7 +3644,7 @@
       <w:pPr>
         <w:pStyle w:val="21"/>
       </w:pPr>
-      <w:bookmarkStart w:id="14" w:name="_Toc235125071"/>
+      <w:bookmarkStart w:id="14" w:name="_Toc235171825"/>
       <w:r>
         <w:t>3.3 Соответствие расчетов и симуляции</w:t>
       </w:r>
@@ -3595,7 +3662,7 @@
       <w:pPr>
         <w:pStyle w:val="21"/>
       </w:pPr>
-      <w:bookmarkStart w:id="15" w:name="_Toc235125072"/>
+      <w:bookmarkStart w:id="15" w:name="_Toc235171826"/>
       <w:r>
         <w:t>3.4 Нештатные ситуации</w:t>
       </w:r>
@@ -3989,7 +4056,7 @@
       <w:pPr>
         <w:pStyle w:val="21"/>
       </w:pPr>
-      <w:bookmarkStart w:id="16" w:name="_Toc235125073"/>
+      <w:bookmarkStart w:id="16" w:name="_Toc235171827"/>
       <w:r>
         <w:t>3.5 Безопасность эксплуатации</w:t>
       </w:r>
@@ -4007,7 +4074,7 @@
       <w:pPr>
         <w:pStyle w:val="1"/>
       </w:pPr>
-      <w:bookmarkStart w:id="17" w:name="_Toc235125074"/>
+      <w:bookmarkStart w:id="17" w:name="_Toc235171828"/>
       <w:r>
         <w:t>4 Интеграция частей: от категории к управляющему воздействию</w:t>
       </w:r>
@@ -4030,7 +4097,7 @@
       <w:pPr>
         <w:pStyle w:val="1"/>
       </w:pPr>
-      <w:bookmarkStart w:id="18" w:name="_Toc235125075"/>
+      <w:bookmarkStart w:id="18" w:name="_Toc235171829"/>
       <w:r>
         <w:t>5 Производительность и временные характеристики</w:t>
       </w:r>
@@ -4065,7 +4132,7 @@
       <w:pPr>
         <w:pStyle w:val="1"/>
       </w:pPr>
-      <w:bookmarkStart w:id="19" w:name="_Toc235125076"/>
+      <w:bookmarkStart w:id="19" w:name="_Toc235171830"/>
       <w:r>
         <w:t>6 Валидация решения</w:t>
       </w:r>
@@ -4075,7 +4142,7 @@
       <w:pPr>
         <w:pStyle w:val="21"/>
       </w:pPr>
-      <w:bookmarkStart w:id="20" w:name="_Toc235125077"/>
+      <w:bookmarkStart w:id="20" w:name="_Toc235171831"/>
       <w:r>
         <w:t>6.1 Основной двойник (Isaac Sim, RTX-сенсоры в контуре)</w:t>
       </w:r>
@@ -4093,7 +4160,7 @@
       <w:pPr>
         <w:pStyle w:val="21"/>
       </w:pPr>
-      <w:bookmarkStart w:id="21" w:name="_Toc235125078"/>
+      <w:bookmarkStart w:id="21" w:name="_Toc235171832"/>
       <w:r>
         <w:t>6.2 Валидационный двойник (MuJoCo)</w:t>
       </w:r>
@@ -4108,7 +4175,7 @@
       <w:pPr>
         <w:pStyle w:val="21"/>
       </w:pPr>
-      <w:bookmarkStart w:id="22" w:name="_Toc235125079"/>
+      <w:bookmarkStart w:id="22" w:name="_Toc235171833"/>
       <w:r>
         <w:t>6.3 Инженерная дисциплина разработки</w:t>
       </w:r>
@@ -4123,7 +4190,7 @@
       <w:pPr>
         <w:pStyle w:val="1"/>
       </w:pPr>
-      <w:bookmarkStart w:id="23" w:name="_Toc235125080"/>
+      <w:bookmarkStart w:id="23" w:name="_Toc235171834"/>
       <w:r>
         <w:t>7 Порядок проверки решения экспертами</w:t>
       </w:r>
@@ -4153,7 +4220,7 @@
       <w:pPr>
         <w:pStyle w:val="1"/>
       </w:pPr>
-      <w:bookmarkStart w:id="24" w:name="_Toc235125081"/>
+      <w:bookmarkStart w:id="24" w:name="_Toc235171835"/>
       <w:r>
         <w:t>8 Ограничения модели и направления развития</w:t>
       </w:r>
@@ -4188,7 +4255,7 @@
       <w:pPr>
         <w:pStyle w:val="1"/>
       </w:pPr>
-      <w:bookmarkStart w:id="25" w:name="_Toc235125082"/>
+      <w:bookmarkStart w:id="25" w:name="_Toc235171836"/>
       <w:r>
         <w:t>Заключение</w:t>
       </w:r>
@@ -4211,7 +4278,7 @@
       <w:pPr>
         <w:pStyle w:val="1"/>
       </w:pPr>
-      <w:bookmarkStart w:id="26" w:name="_Toc235125083"/>
+      <w:bookmarkStart w:id="26" w:name="_Toc235171837"/>
       <w:r>
         <w:t>Приложение А. Видеоматериалы</w:t>
       </w:r>
@@ -4766,7 +4833,7 @@
       <w:pPr>
         <w:pStyle w:val="1"/>
       </w:pPr>
-      <w:bookmarkStart w:id="27" w:name="_Toc235125084"/>
+      <w:bookmarkStart w:id="27" w:name="_Toc235171838"/>
       <w:r>
         <w:t>Приложение Б. Итоговые значения контрольных показателей</w:t>
       </w:r>
@@ -5312,7 +5379,7 @@
       </w:r>
     </w:p>
     <w:sectPr>
-      <w:footerReference w:type="default" r:id="rId11"/>
+      <w:footerReference w:type="default" r:id="rId12"/>
       <w:pgSz w:w="11906" w:h="16838"/>
       <w:pgMar w:top="1134" w:right="850" w:bottom="1134" w:left="1701" w:header="720" w:footer="720" w:gutter="0"/>
       <w:cols w:space="720"/>
@@ -5588,31 +5655,31 @@
       </w:rPr>
     </w:lvl>
   </w:abstractNum>
-  <w:num w:numId="1" w16cid:durableId="87896779">
+  <w:num w:numId="1" w16cid:durableId="1107627122">
     <w:abstractNumId w:val="8"/>
   </w:num>
-  <w:num w:numId="2" w16cid:durableId="2067753567">
+  <w:num w:numId="2" w16cid:durableId="11806944">
     <w:abstractNumId w:val="6"/>
   </w:num>
-  <w:num w:numId="3" w16cid:durableId="812526435">
+  <w:num w:numId="3" w16cid:durableId="2088305677">
     <w:abstractNumId w:val="5"/>
   </w:num>
-  <w:num w:numId="4" w16cid:durableId="1083642688">
+  <w:num w:numId="4" w16cid:durableId="85276099">
     <w:abstractNumId w:val="4"/>
   </w:num>
-  <w:num w:numId="5" w16cid:durableId="2072271973">
+  <w:num w:numId="5" w16cid:durableId="1124881658">
     <w:abstractNumId w:val="7"/>
   </w:num>
-  <w:num w:numId="6" w16cid:durableId="1089886090">
+  <w:num w:numId="6" w16cid:durableId="1835759648">
     <w:abstractNumId w:val="3"/>
   </w:num>
-  <w:num w:numId="7" w16cid:durableId="123693269">
+  <w:num w:numId="7" w16cid:durableId="1340816985">
     <w:abstractNumId w:val="2"/>
   </w:num>
-  <w:num w:numId="8" w16cid:durableId="1824420510">
+  <w:num w:numId="8" w16cid:durableId="2094474595">
     <w:abstractNumId w:val="1"/>
   </w:num>
-  <w:num w:numId="9" w16cid:durableId="1552233862">
+  <w:num w:numId="9" w16cid:durableId="952442175">
     <w:abstractNumId w:val="0"/>
   </w:num>
 </w:numbering>
@@ -17014,7 +17081,7 @@
     <w:autoRedefine/>
     <w:uiPriority w:val="39"/>
     <w:unhideWhenUsed/>
-    <w:rsid w:val="00EF4C72"/>
+    <w:rsid w:val="00AD538C"/>
     <w:pPr>
       <w:spacing w:after="100"/>
     </w:pPr>
@@ -17026,7 +17093,7 @@
     <w:autoRedefine/>
     <w:uiPriority w:val="39"/>
     <w:unhideWhenUsed/>
-    <w:rsid w:val="00EF4C72"/>
+    <w:rsid w:val="00AD538C"/>
     <w:pPr>
       <w:spacing w:after="100"/>
       <w:ind w:left="280"/>
@@ -17037,7 +17104,7 @@
     <w:basedOn w:val="a2"/>
     <w:uiPriority w:val="99"/>
     <w:unhideWhenUsed/>
-    <w:rsid w:val="00EF4C72"/>
+    <w:rsid w:val="00AD538C"/>
     <w:rPr>
       <w:color w:val="0000FF" w:themeColor="hyperlink"/>
       <w:u w:val="single"/>

</xml_diff>